<commit_message>
Rework thumbnails to avoid cloning source layout; diversify composition for higher CTR
</commit_message>
<xml_diff>
--- a/The Logic Nexus - Could L Catch Spider-Man.docx
+++ b/The Logic Nexus - Could L Catch Spider-Man.docx
@@ -4429,7 +4429,7 @@
         <w:spacing w:after="100" w:before="200"/>
       </w:pPr>
       <w:r>
-        <w:t xml:space="preserve">Thumbnail 1</w:t>
+        <w:t xml:space="preserve">Thumbnail 1 — Action-scale asymmetric</w:t>
       </w:r>
     </w:p>
     <w:p>
@@ -4444,7 +4444,7 @@
         <w:t xml:space="preserve">Concept: </w:t>
       </w:r>
       <w:r>
-        <w:t xml:space="preserve">Spider-Man vs. L split-face mugshot, red web backdrop on the left, cool grey-blue Death Note tones on the right, height-ruler lines behind both.</w:t>
+        <w:t xml:space="preserve">Spider-Man dominates the frame mid-swing across a night skyline, huge and dynamic; a small inset of L's face, lit by a tablet glow, sits low in the corner with a thin red targeting reticle locked onto Spider-Man from across the city.</w:t>
       </w:r>
     </w:p>
     <w:p>
@@ -4474,7 +4474,7 @@
         <w:t xml:space="preserve">Emotion Trigger: </w:t>
       </w:r>
       <w:r>
-        <w:t xml:space="preserve">Curiosity + rivalry via instant dual-recognition</w:t>
+        <w:t xml:space="preserve">Scale mismatch — a global hero being quietly targeted by one ordinary-looking guy</w:t>
       </w:r>
     </w:p>
     <w:p>
@@ -4489,7 +4489,7 @@
         <w:t xml:space="preserve">Prompt: </w:t>
       </w:r>
       <w:r>
-        <w:t xml:space="preserve">Photorealistic/anime-hybrid thumbnail, symmetrical split-face composition: Spider-Man's masked face on the left half against a red spider-web-textured mugshot backdrop with height-ruler lines, L's pale anime face on the right half against a cool grey-blue backdrop with matching ruler lines, hard vertical seam down the center, small Death Note book icon in the lower-left corner, bold white timestamp badge bottom-right, high contrast, mugshot-lineup framing.</w:t>
+        <w:t xml:space="preserve">Photorealistic superhero-film-style thumbnail, dynamic wide night shot of Spider-Man swinging large and heroic across a glowing city skyline filling most of the frame, small inset panel bottom-left showing L's pale anime-style face lit by a tablet screen, a thin glowing red targeting reticle drawn from the inset toward Spider-Man's silhouette, strong warm-vs-cool color contrast, bold white timestamp badge bottom-right, no ruler lines, no mugshot backdrop.</w:t>
       </w:r>
     </w:p>
     <w:p>
@@ -4498,7 +4498,7 @@
         <w:spacing w:after="100" w:before="200"/>
       </w:pPr>
       <w:r>
-        <w:t xml:space="preserve">Thumbnail 2</w:t>
+        <w:t xml:space="preserve">Thumbnail 2 — Extreme eye close-up with data overlay</w:t>
       </w:r>
     </w:p>
     <w:p>
@@ -4513,7 +4513,7 @@
         <w:t xml:space="preserve">Concept: </w:t>
       </w:r>
       <w:r>
-        <w:t xml:space="preserve">Close-up eyes-only split — Spider-Man's lens-eyes vs. L's real eyes, extreme crop for intensity.</w:t>
+        <w:t xml:space="preserve">Single extreme close-up on L's eye, Spider-Man's silhouette and a HUD-style probability readout reflected in the iris.</w:t>
       </w:r>
     </w:p>
     <w:p>
@@ -4528,7 +4528,7 @@
         <w:t xml:space="preserve">Text Overlay: </w:t>
       </w:r>
       <w:r>
-        <w:t xml:space="preserve">"CAUGHT?" in bold white condensed sans-serif, upper third</w:t>
+        <w:t xml:space="preserve">"HE ALREADY KNOWS" in bold condensed white caps, lower third</w:t>
       </w:r>
     </w:p>
     <w:p>
@@ -4543,7 +4543,7 @@
         <w:t xml:space="preserve">Emotion Trigger: </w:t>
       </w:r>
       <w:r>
-        <w:t xml:space="preserve">Tension, suspense</w:t>
+        <w:t xml:space="preserve">Unease — the target has no idea how much is already known</w:t>
       </w:r>
     </w:p>
     <w:p>
@@ -4558,7 +4558,7 @@
         <w:t xml:space="preserve">Prompt: </w:t>
       </w:r>
       <w:r>
-        <w:t xml:space="preserve">Symmetrical split extreme close-up thumbnail: Spider-Man's white lens eyes on the left half, L's wide dark eyes on the right half, both cropped tight to just the eyes and brow, red web texture bleeding into cool blue-grey on the right, bold white condensed text "CAUGHT?" across the top third, harsh contrast lighting.</w:t>
+        <w:t xml:space="preserve">Anime-detective-thriller extreme macro close-up thumbnail on a single wide dark eye, a small sharp reflection in the iris showing Spider-Man's masked silhouette overlaid with faint glowing case-file data lines, cool blue-grey palette, dramatic underlighting, bold condensed white text "HE ALREADY KNOWS" across the lower third, bold white timestamp badge bottom-right, no split-screen, no ruler backdrop.</w:t>
       </w:r>
     </w:p>
     <w:p>
@@ -4567,7 +4567,7 @@
         <w:spacing w:after="100" w:before="200"/>
       </w:pPr>
       <w:r>
-        <w:t xml:space="preserve">Thumbnail 3</w:t>
+        <w:t xml:space="preserve">Thumbnail 3 — Bold graphic text-forward</w:t>
       </w:r>
     </w:p>
     <w:p>
@@ -4582,7 +4582,7 @@
         <w:t xml:space="preserve">Concept: </w:t>
       </w:r>
       <w:r>
-        <w:t xml:space="preserve">Full mugshot-board version with both characters' entire heads and a glowing red "IDENTIFIED" stamp diagonally across the seam.</w:t>
+        <w:t xml:space="preserve">A single massive word dominates a dark color-blocked background; a small photoreal inset shows Spider-Man's mask cracking under a red diagnostic overlay.</w:t>
       </w:r>
     </w:p>
     <w:p>
@@ -4597,7 +4597,7 @@
         <w:t xml:space="preserve">Text Overlay: </w:t>
       </w:r>
       <w:r>
-        <w:t xml:space="preserve">"IDENTIFIED" diagonal red stamp</w:t>
+        <w:t xml:space="preserve">"CAUGHT." in huge bold white/red condensed type, centered</w:t>
       </w:r>
     </w:p>
     <w:p>
@@ -4612,7 +4612,7 @@
         <w:t xml:space="preserve">Emotion Trigger: </w:t>
       </w:r>
       <w:r>
-        <w:t xml:space="preserve">Dread/finality</w:t>
+        <w:t xml:space="preserve">Blunt finality — the outcome stated before you even click</w:t>
       </w:r>
     </w:p>
     <w:p>
@@ -4627,7 +4627,7 @@
         <w:t xml:space="preserve">Prompt: </w:t>
       </w:r>
       <w:r>
-        <w:t xml:space="preserve">Split-face mugshot thumbnail, Spider-Man left half on red web backdrop, L right half on cool blue-grey backdrop, height-ruler lines behind both, a bold diagonal red "IDENTIFIED" stamp graphic overlaid across the center seam, bold white timestamp badge bottom-right, high-contrast police-lineup lighting.</w:t>
+        <w:t xml:space="preserve">Bold graphic YouTube thumbnail, huge centered white-and-red condensed text "CAUGHT." filling most of the frame against a near-black background, small photorealistic inset in the lower-right corner showing Spider-Man's mask with a faint red diagnostic scan-line overlay across it, minimal other elements, extreme text-to-image contrast, bold white timestamp badge bottom-left.</w:t>
       </w:r>
     </w:p>
     <w:p>
@@ -4636,7 +4636,7 @@
         <w:spacing w:after="100" w:before="200"/>
       </w:pPr>
       <w:r>
-        <w:t xml:space="preserve">Thumbnail 4</w:t>
+        <w:t xml:space="preserve">Thumbnail 4 — Environmental stakeout</w:t>
       </w:r>
     </w:p>
     <w:p>
@@ -4651,7 +4651,7 @@
         <w:t xml:space="preserve">Concept: </w:t>
       </w:r>
       <w:r>
-        <w:t xml:space="preserve">Wider composition showing L's hunched full body crouched on a chair on the right, Spider-Man crouched mirroring the pose on the left, symmetrical stance mirroring tension.</w:t>
+        <w:t xml:space="preserve">Wide cinematic rooftop shot — Spider-Man perched unaware in the distance, foreground silhouette of L watching from a fire escape with a faint red targeting line connecting them.</w:t>
       </w:r>
     </w:p>
     <w:p>
@@ -4681,7 +4681,7 @@
         <w:t xml:space="preserve">Emotion Trigger: </w:t>
       </w:r>
       <w:r>
-        <w:t xml:space="preserve">Visual rivalry through mirrored body language</w:t>
+        <w:t xml:space="preserve">Voyeuristic tension — being watched without knowing it</w:t>
       </w:r>
     </w:p>
     <w:p>
@@ -4696,7 +4696,7 @@
         <w:t xml:space="preserve">Prompt: </w:t>
       </w:r>
       <w:r>
-        <w:t xml:space="preserve">Symmetrical split thumbnail, Spider-Man crouched Spider-Man-pose on the left against a red web-textured mugshot backdrop, L crouched in his signature hunched sitting pose on the right against a cool blue-grey backdrop, matching height-ruler lines behind both, mirrored crouching stances creating visual tension, bold white timestamp badge bottom-right.</w:t>
+        <w:t xml:space="preserve">Photorealistic superhero-film-style wide cinematic thumbnail, Spider-Man perched small and unaware on a distant rooftop under moody teal-desaturated dusk light, a silhouetted figure (L) watching from a fire escape in the foreground, a faint glowing red line connecting the two across the frame, strong depth and scale contrast, no text block, bold white timestamp badge bottom-right.</w:t>
       </w:r>
     </w:p>
     <w:p>
@@ -4705,7 +4705,7 @@
         <w:spacing w:after="100" w:before="200"/>
       </w:pPr>
       <w:r>
-        <w:t xml:space="preserve">Thumbnail 5</w:t>
+        <w:t xml:space="preserve">Thumbnail 5 — HUD countdown graphic</w:t>
       </w:r>
     </w:p>
     <w:p>
@@ -4720,7 +4720,7 @@
         <w:t xml:space="preserve">Concept: </w:t>
       </w:r>
       <w:r>
-        <w:t xml:space="preserve">Negative-space version — mostly dark/black background, only the two faces lit dramatically, spider-web cracks radiating from the seam like a shattered mugshot photo.</w:t>
+        <w:t xml:space="preserve">A giant glowing countdown numeral dominates the frame as the hero graphic, Spider-Man's silhouette barely visible behind translucent scrolling case-file data, L glimpsed only as a small reflection in a monitor corner.</w:t>
       </w:r>
     </w:p>
     <w:p>
@@ -4735,7 +4735,7 @@
         <w:t xml:space="preserve">Text Overlay: </w:t>
       </w:r>
       <w:r>
-        <w:t xml:space="preserve">"9 DAYS" in bold white numerals, bottom-left</w:t>
+        <w:t xml:space="preserve">"9 DAYS" as the dominant glowing HUD numeral (not a caption — it IS the graphic)</w:t>
       </w:r>
     </w:p>
     <w:p>
@@ -4750,7 +4750,7 @@
         <w:t xml:space="preserve">Emotion Trigger: </w:t>
       </w:r>
       <w:r>
-        <w:t xml:space="preserve">Urgency, ticking-clock stakes</w:t>
+        <w:t xml:space="preserve">Ticking-clock urgency</w:t>
       </w:r>
     </w:p>
     <w:p>
@@ -4765,7 +4765,7 @@
         <w:t xml:space="preserve">Prompt: </w:t>
       </w:r>
       <w:r>
-        <w:t xml:space="preserve">Dramatic low-key split-face thumbnail on a near-black background, Spider-Man's masked face dramatically lit on the left, L's pale face dramatically lit on the right, cracked spider-web fracture lines radiating outward from the center seam like shattered glass, bold white numerals "9 DAYS" bottom-left, bold white timestamp badge bottom-right, high contrast dramatic lighting.</w:t>
+        <w:t xml:space="preserve">Anime-detective-thriller HUD-style thumbnail, giant glowing digital numerals "9 DAYS" dominating the center of the frame like a countdown readout, Spider-Man's masked silhouette faintly visible behind translucent scrolling case-file text and data streams, a small reflection of L's face barely visible in a monitor corner bottom-left, cold blue-grey glow throughout, bold white timestamp badge bottom-right.</w:t>
       </w:r>
     </w:p>
     <w:sectPr>

</xml_diff>